<commit_message>
Update plan and README for the approved proposal
</commit_message>
<xml_diff>
--- a/docs/project-plan.docx
+++ b/docs/project-plan.docx
@@ -71,7 +71,7 @@
         <w:rPr>
           <w:rFonts w:ascii="Times New Roman" w:hAnsi="Times New Roman" w:cs="Times New Roman"/>
         </w:rPr>
-        <w:t>The proposal has three parts. An AI model identifies the filter. A DSP inverse filter tries to bring back what the filter turned down. A second AI model figures out what the brought-back sounds are.</w:t>
+        <w:t xml:space="preserve">The professor approved our revised proposal. It has three parts. An AI model identifies the filter's type, order, and cutoffs. A DSP compensation filter (our inverse filter) uses those estimates to bring back what the filter turned down. A second AI model detects and classifies the events in the compensated audio.</w:t>
       </w:r>
     </w:p>
     <w:p>
@@ -89,48 +89,7 @@
         <w:rPr>
           <w:rFonts w:ascii="Times New Roman" w:hAnsi="Times New Roman" w:cs="Times New Roman"/>
         </w:rPr>
-        <w:t>We test on simulated signals. We haven't found a usable public collection of cockpit recordings with clean originals and known filter settings. Cockpit voice recorder (CVR) audio is also legally protected. Under 49 U.S.C. 1114(c), the NTSB "may not disclose publicly any part of a cockpit voice or video recorder recording," though it can release transcripts. EU rules protect the recordings by default and only allow disclosure in limited cases.</w:t>
-      </w:r>
-    </w:p>
-    <w:p>
-      <w:pPr>
-        <w:pStyle w:val="Heading1"/>
-        <w:rPr>
-          <w:rFonts w:ascii="Times New Roman" w:hAnsi="Times New Roman" w:cs="Times New Roman"/>
-        </w:rPr>
-      </w:pPr>
-      <w:r>
-        <w:rPr>
-          <w:rFonts w:ascii="Times New Roman" w:hAnsi="Times New Roman" w:cs="Times New Roman"/>
-        </w:rPr>
-        <w:t>Start Now</w:t>
-      </w:r>
-    </w:p>
-    <w:p>
-      <w:pPr>
-        <w:rPr>
-          <w:rFonts w:ascii="Times New Roman" w:hAnsi="Times New Roman" w:cs="Times New Roman"/>
-        </w:rPr>
-      </w:pPr>
-      <w:r>
-        <w:rPr>
-          <w:rFonts w:ascii="Times New Roman" w:hAnsi="Times New Roman" w:cs="Times New Roman"/>
-        </w:rPr>
-        <w:t xml:space="preserve">Every version of the project needs the same groundwork. We take clean audio, filter it with known settings, and save everything we </w:t>
-      </w:r>
-      <w:proofErr w:type="gramStart"/>
-      <w:r>
-        <w:rPr>
-          <w:rFonts w:ascii="Times New Roman" w:hAnsi="Times New Roman" w:cs="Times New Roman"/>
-        </w:rPr>
-        <w:t>did</w:t>
-      </w:r>
-      <w:proofErr w:type="gramEnd"/>
-      <w:r>
-        <w:rPr>
-          <w:rFonts w:ascii="Times New Roman" w:hAnsi="Times New Roman" w:cs="Times New Roman"/>
-        </w:rPr>
-        <w:t xml:space="preserve"> so the labels can be trusted. Where something below depends on an open decision, it's a default we can change later.</w:t>
+        <w:t xml:space="preserve">We test on our own recordings, filtered with known settings. We haven't found a usable public collection of cockpit recordings with clean originals and known filter settings. Cockpit voice recorder (CVR) audio is also legally protected. Under 49 U.S.C. 1114(c), the NTSB "may not disclose publicly any part of a cockpit voice or video recorder recording," though it can release transcripts. EU rules protect the recordings by default and only allow disclosure in limited cases.</w:t>
       </w:r>
     </w:p>
     <w:p>
@@ -148,7 +107,48 @@
         <w:rPr>
           <w:rFonts w:ascii="Times New Roman" w:hAnsi="Times New Roman" w:cs="Times New Roman"/>
         </w:rPr>
-        <w:t>We'll set up the Python environment and a dependency list. We'll also start a README with run instructions and an experiment log, since the course needs both at the end.</w:t>
+        <w:t xml:space="preserve">The main deliverable is a Windows or Linux app that processes prerecorded WAV files offline. It reports the predicted filter and the detected events, and it saves the compensated audio so we can check it in a DAW. Running on the MicroBlaze and live-stream analysis are stretch goals, not requirements.</w:t>
+      </w:r>
+    </w:p>
+    <w:p>
+      <w:pPr>
+        <w:pStyle w:val="Heading1"/>
+        <w:rPr>
+          <w:rFonts w:ascii="Times New Roman" w:hAnsi="Times New Roman" w:cs="Times New Roman"/>
+        </w:rPr>
+      </w:pPr>
+      <w:r>
+        <w:rPr>
+          <w:rFonts w:ascii="Times New Roman" w:hAnsi="Times New Roman" w:cs="Times New Roman"/>
+        </w:rPr>
+        <w:t>Start Now</w:t>
+      </w:r>
+    </w:p>
+    <w:p>
+      <w:pPr>
+        <w:rPr>
+          <w:rFonts w:ascii="Times New Roman" w:hAnsi="Times New Roman" w:cs="Times New Roman"/>
+        </w:rPr>
+      </w:pPr>
+      <w:r>
+        <w:rPr>
+          <w:rFonts w:ascii="Times New Roman" w:hAnsi="Times New Roman" w:cs="Times New Roman"/>
+        </w:rPr>
+        <w:t xml:space="preserve">Every version of the project needs the same groundwork. We take clean audio, filter it with known settings, and save everything we </w:t>
+      </w:r>
+      <w:proofErr w:type="gramStart"/>
+      <w:r>
+        <w:rPr>
+          <w:rFonts w:ascii="Times New Roman" w:hAnsi="Times New Roman" w:cs="Times New Roman"/>
+        </w:rPr>
+        <w:t>did</w:t>
+      </w:r>
+      <w:proofErr w:type="gramEnd"/>
+      <w:r>
+        <w:rPr>
+          <w:rFonts w:ascii="Times New Roman" w:hAnsi="Times New Roman" w:cs="Times New Roman"/>
+        </w:rPr>
+        <w:t xml:space="preserve"> so the labels can be trusted. Where something below depends on an open decision, it's a default we can change later.</w:t>
       </w:r>
     </w:p>
     <w:p>
@@ -166,7 +166,7 @@
         <w:rPr>
           <w:rFonts w:ascii="Times New Roman" w:hAnsi="Times New Roman" w:cs="Times New Roman"/>
         </w:rPr>
-        <w:t>We'll write a filter function that takes a filter description and returns the filtered audio. The description covers the type, order, cutoffs, and filter family, and it's easy to add more later.</w:t>
+        <w:t>We'll set up the Python environment and a dependency list. We'll also start a README with run instructions and an experiment log, since the course needs both at the end.</w:t>
       </w:r>
     </w:p>
     <w:p>
@@ -184,21 +184,7 @@
         <w:rPr>
           <w:rFonts w:ascii="Times New Roman" w:hAnsi="Times New Roman" w:cs="Times New Roman"/>
         </w:rPr>
-        <w:t xml:space="preserve">We'll write down how we count filter order. A band-pass filter built with order N in SciPy </w:t>
-      </w:r>
-      <w:proofErr w:type="gramStart"/>
-      <w:r>
-        <w:rPr>
-          <w:rFonts w:ascii="Times New Roman" w:hAnsi="Times New Roman" w:cs="Times New Roman"/>
-        </w:rPr>
-        <w:t>actually ends</w:t>
-      </w:r>
-      <w:proofErr w:type="gramEnd"/>
-      <w:r>
-        <w:rPr>
-          <w:rFonts w:ascii="Times New Roman" w:hAnsi="Times New Roman" w:cs="Times New Roman"/>
-        </w:rPr>
-        <w:t xml:space="preserve"> up with order 2N, so the labels need one clear rule.</w:t>
+        <w:t xml:space="preserve">We'll write a filter function that takes a filter description and returns the filtered audio. The description covers the type, order, and cutoffs. The proposal only uses Butterworth filters, but the function can take other families if we add them later.</w:t>
       </w:r>
     </w:p>
     <w:p>
@@ -216,7 +202,7 @@
         <w:rPr>
           <w:rFonts w:ascii="Times New Roman" w:hAnsi="Times New Roman" w:cs="Times New Roman"/>
         </w:rPr>
-        <w:t>Every example saves its own record. That record has the exact filter settings, the source sounds it used, the levels, and the seed. A seed alone isn't enough to rebuild an example.</w:t>
+        <w:t xml:space="preserve">We'll write down how we count filter order. The proposal starts with orders 1, 2, and 4. A band-pass filter built with order N in SciPy actually ends up with order 2N, so the labels need one clear rule. For now we count total poles, which means a band-pass can't be first order (see Channel Assumptions).</w:t>
       </w:r>
     </w:p>
     <w:p>
@@ -234,7 +220,7 @@
         <w:rPr>
           <w:rFonts w:ascii="Times New Roman" w:hAnsi="Times New Roman" w:cs="Times New Roman"/>
         </w:rPr>
-        <w:t>Noise and rounding to 16-bit are settings, not fixed steps. We'll decide later where the noise goes and what bit depth we use. For now, 16-bit is just the first test case.</w:t>
+        <w:t xml:space="preserve">Every example saves its own record. That record has the exact filter settings, the source recording it came from, the levels, the noise settings, and the seed. A seed alone isn't enough to rebuild an example.</w:t>
       </w:r>
     </w:p>
     <w:p>
@@ -252,7 +238,7 @@
         <w:rPr>
           <w:rFonts w:ascii="Times New Roman" w:hAnsi="Times New Roman" w:cs="Times New Roman"/>
         </w:rPr>
-        <w:t>We'll store filters as chains of second-order sections. That keeps the coefficients and test cases reusable in C or on the FPGA. The board version will still need its own implementation and testing.</w:t>
+        <w:t xml:space="preserve">Noise is a setting, not a fixed step. The proposal adds noise at several SNRs and tests it both before and after the filter, so every record says which one it was. Rounding to a bit depth defaults to 24-bit to match the source audio.</w:t>
       </w:r>
     </w:p>
     <w:p>
@@ -270,7 +256,7 @@
         <w:rPr>
           <w:rFonts w:ascii="Times New Roman" w:hAnsi="Times New Roman" w:cs="Times New Roman"/>
         </w:rPr>
-        <w:t>The sample rate is a setting, and we'll prototype at 44.1 or 48 kHz. The proposal's example has a 10 kHz hiss, and a 16 kHz sample rate can't hold anything above 8 kHz.</w:t>
+        <w:t xml:space="preserve">We'll store filters as chains of second-order sections. That keeps the coefficients and test cases reusable in C if we get to the MicroBlaze. The board version would still need its own implementation and testing.</w:t>
       </w:r>
     </w:p>
     <w:p>
@@ -288,21 +274,7 @@
         <w:rPr>
           <w:rFonts w:ascii="Times New Roman" w:hAnsi="Times New Roman" w:cs="Times New Roman"/>
         </w:rPr>
-        <w:t xml:space="preserve">We'll check every filter by measuring the response of the filtering we </w:t>
-      </w:r>
-      <w:proofErr w:type="gramStart"/>
-      <w:r>
-        <w:rPr>
-          <w:rFonts w:ascii="Times New Roman" w:hAnsi="Times New Roman" w:cs="Times New Roman"/>
-        </w:rPr>
-        <w:t>actually applied</w:t>
-      </w:r>
-      <w:proofErr w:type="gramEnd"/>
-      <w:r>
-        <w:rPr>
-          <w:rFonts w:ascii="Times New Roman" w:hAnsi="Times New Roman" w:cs="Times New Roman"/>
-        </w:rPr>
-        <w:t>. Then we compare it to what we asked for.</w:t>
+        <w:t xml:space="preserve">The proposal uses 192 kHz, 24-bit audio, so that's our default sample rate, and the code is checked at 192 kHz. It's still a setting. Python does its math in 64-bit floats, which is at least as precise as the 32-bit processing in the proposal.</w:t>
       </w:r>
     </w:p>
     <w:p>
@@ -320,7 +292,21 @@
         <w:rPr>
           <w:rFonts w:ascii="Times New Roman" w:hAnsi="Times New Roman" w:cs="Times New Roman"/>
         </w:rPr>
-        <w:t>We'll test with simple sounds first. Those are a 100 Hz tone, a short thump, and noise. They're only for checking the code, not our final event types.</w:t>
+        <w:t xml:space="preserve">We'll check every filter by measuring the response of the filtering we </w:t>
+      </w:r>
+      <w:proofErr w:type="gramStart"/>
+      <w:r>
+        <w:rPr>
+          <w:rFonts w:ascii="Times New Roman" w:hAnsi="Times New Roman" w:cs="Times New Roman"/>
+        </w:rPr>
+        <w:t>actually applied</w:t>
+      </w:r>
+      <w:proofErr w:type="gramEnd"/>
+      <w:r>
+        <w:rPr>
+          <w:rFonts w:ascii="Times New Roman" w:hAnsi="Times New Roman" w:cs="Times New Roman"/>
+        </w:rPr>
+        <w:t>. Then we compare it to what we asked for.</w:t>
       </w:r>
     </w:p>
     <w:p>
@@ -338,22 +324,7 @@
         <w:rPr>
           <w:rFonts w:ascii="Times New Roman" w:hAnsi="Times New Roman" w:cs="Times New Roman"/>
         </w:rPr>
-        <w:lastRenderedPageBreak/>
-        <w:t xml:space="preserve">When we mix sounds, the source sounds get picked independently of the filter settings. </w:t>
-      </w:r>
-      <w:proofErr w:type="gramStart"/>
-      <w:r>
-        <w:rPr>
-          <w:rFonts w:ascii="Times New Roman" w:hAnsi="Times New Roman" w:cs="Times New Roman"/>
-        </w:rPr>
-        <w:t>Otherwise</w:t>
-      </w:r>
-      <w:proofErr w:type="gramEnd"/>
-      <w:r>
-        <w:rPr>
-          <w:rFonts w:ascii="Times New Roman" w:hAnsi="Times New Roman" w:cs="Times New Roman"/>
-        </w:rPr>
-        <w:t xml:space="preserve"> the AI could learn to recognize the sounds instead of the filter.</w:t>
+        <w:t xml:space="preserve">The real data is 10-20 source recordings with speech, mechanical tones, broadband sounds, and short transients. Until we have them, we test with simple sounds: a 100 Hz tone, a short thump, and noise. Those are only for checking the code, not our final event types.</w:t>
       </w:r>
     </w:p>
     <w:p>
@@ -371,7 +342,22 @@
         <w:rPr>
           <w:rFonts w:ascii="Times New Roman" w:hAnsi="Times New Roman" w:cs="Times New Roman"/>
         </w:rPr>
-        <w:t>We'll write down what each part takes in and puts out. That covers the filter ID model, the inverse filter, and the event model, so people can work on them separately.</w:t>
+        <w:lastRenderedPageBreak/>
+        <w:t xml:space="preserve">When we mix sounds, the source sounds get picked independently of the filter settings. </w:t>
+      </w:r>
+      <w:proofErr w:type="gramStart"/>
+      <w:r>
+        <w:rPr>
+          <w:rFonts w:ascii="Times New Roman" w:hAnsi="Times New Roman" w:cs="Times New Roman"/>
+        </w:rPr>
+        <w:t>Otherwise</w:t>
+      </w:r>
+      <w:proofErr w:type="gramEnd"/>
+      <w:r>
+        <w:rPr>
+          <w:rFonts w:ascii="Times New Roman" w:hAnsi="Times New Roman" w:cs="Times New Roman"/>
+        </w:rPr>
+        <w:t xml:space="preserve"> the AI could learn to recognize the sounds instead of the filter.</w:t>
       </w:r>
     </w:p>
     <w:p>
@@ -389,21 +375,25 @@
         <w:rPr>
           <w:rFonts w:ascii="Times New Roman" w:hAnsi="Times New Roman" w:cs="Times New Roman"/>
         </w:rPr>
-        <w:t xml:space="preserve">We'll make one example plot for the third revision. It shows how far a 100 Hz rumble and a 10 kHz </w:t>
-      </w:r>
-      <w:proofErr w:type="gramStart"/>
-      <w:r>
-        <w:rPr>
-          <w:rFonts w:ascii="Times New Roman" w:hAnsi="Times New Roman" w:cs="Times New Roman"/>
-        </w:rPr>
-        <w:t>hiss</w:t>
-      </w:r>
-      <w:proofErr w:type="gramEnd"/>
-      <w:r>
-        <w:rPr>
-          <w:rFonts w:ascii="Times New Roman" w:hAnsi="Times New Roman" w:cs="Times New Roman"/>
-        </w:rPr>
-        <w:t xml:space="preserve"> drop under the proposal's 250 Hz to 6 kHz band-pass at a few filter orders, compared to the noise floor. It's an illustration, and we'll redo it once the test data choices are settled.</w:t>
+        <w:t>We'll write down what each part takes in and puts out. That covers the filter ID model, the inverse filter, and the event model, so people can work on them separately.</w:t>
+      </w:r>
+    </w:p>
+    <w:p>
+      <w:pPr>
+        <w:pStyle w:val="ListParagraph"/>
+        <w:numPr>
+          <w:ilvl w:val="0"/>
+          <w:numId w:val="2"/>
+        </w:numPr>
+        <w:rPr>
+          <w:rFonts w:ascii="Times New Roman" w:hAnsi="Times New Roman" w:cs="Times New Roman"/>
+        </w:rPr>
+      </w:pPr>
+      <w:r>
+        <w:rPr>
+          <w:rFonts w:ascii="Times New Roman" w:hAnsi="Times New Roman" w:cs="Times New Roman"/>
+        </w:rPr>
+        <w:t xml:space="preserve">We'll make one example plot for the report. It shows how far a 100 Hz rumble and a 10 kHz hiss drop under the proposal's 250 Hz to 6 kHz band-pass at a few filter orders, compared to the noise floor. It's an illustration, and we'll redo it once the test data choices are settled.</w:t>
       </w:r>
     </w:p>
     <w:p>
@@ -444,83 +434,33 @@
         <w:rPr>
           <w:rFonts w:ascii="Times New Roman" w:hAnsi="Times New Roman" w:cs="Times New Roman"/>
         </w:rPr>
-        <w:t xml:space="preserve">What Runs on the </w:t>
-      </w:r>
-      <w:proofErr w:type="spellStart"/>
-      <w:r>
-        <w:rPr>
-          <w:rFonts w:ascii="Times New Roman" w:hAnsi="Times New Roman" w:cs="Times New Roman"/>
-        </w:rPr>
-        <w:t>MicroBlaze</w:t>
-      </w:r>
-      <w:proofErr w:type="spellEnd"/>
-    </w:p>
-    <w:p>
-      <w:pPr>
-        <w:rPr>
-          <w:rFonts w:ascii="Times New Roman" w:hAnsi="Times New Roman" w:cs="Times New Roman"/>
-        </w:rPr>
-      </w:pPr>
-      <w:r>
-        <w:rPr>
-          <w:rFonts w:ascii="Times New Roman" w:hAnsi="Times New Roman" w:cs="Times New Roman"/>
-        </w:rPr>
-        <w:t xml:space="preserve">The professor wants the </w:t>
-      </w:r>
-      <w:proofErr w:type="spellStart"/>
-      <w:r>
-        <w:rPr>
-          <w:rFonts w:ascii="Times New Roman" w:hAnsi="Times New Roman" w:cs="Times New Roman"/>
-        </w:rPr>
-        <w:t>MicroBlaze</w:t>
-      </w:r>
-      <w:proofErr w:type="spellEnd"/>
-      <w:r>
-        <w:rPr>
-          <w:rFonts w:ascii="Times New Roman" w:hAnsi="Times New Roman" w:cs="Times New Roman"/>
-        </w:rPr>
-        <w:t xml:space="preserve"> involved, so some part of the AI </w:t>
-      </w:r>
-      <w:proofErr w:type="gramStart"/>
-      <w:r>
-        <w:rPr>
-          <w:rFonts w:ascii="Times New Roman" w:hAnsi="Times New Roman" w:cs="Times New Roman"/>
-        </w:rPr>
-        <w:t>has to</w:t>
-      </w:r>
-      <w:proofErr w:type="gramEnd"/>
-      <w:r>
-        <w:rPr>
-          <w:rFonts w:ascii="Times New Roman" w:hAnsi="Times New Roman" w:cs="Times New Roman"/>
-        </w:rPr>
-        <w:t xml:space="preserve"> run there. We need to decide which parts run on the </w:t>
-      </w:r>
-      <w:proofErr w:type="gramStart"/>
-      <w:r>
-        <w:rPr>
-          <w:rFonts w:ascii="Times New Roman" w:hAnsi="Times New Roman" w:cs="Times New Roman"/>
-        </w:rPr>
-        <w:t>board</w:t>
-      </w:r>
-      <w:proofErr w:type="gramEnd"/>
-      <w:r>
-        <w:rPr>
-          <w:rFonts w:ascii="Times New Roman" w:hAnsi="Times New Roman" w:cs="Times New Roman"/>
-        </w:rPr>
-        <w:t xml:space="preserve"> and which stay on the PC. We also need to decide how data gets to the board and what comes back over UART.</w:t>
-      </w:r>
-    </w:p>
-    <w:p>
-      <w:pPr>
-        <w:rPr>
-          <w:rFonts w:ascii="Times New Roman" w:hAnsi="Times New Roman" w:cs="Times New Roman"/>
-        </w:rPr>
-      </w:pPr>
-      <w:r>
-        <w:rPr>
-          <w:rFonts w:ascii="Times New Roman" w:hAnsi="Times New Roman" w:cs="Times New Roman"/>
-        </w:rPr>
-        <w:t>Separately, we need to decide the timing. One option is to build on the PC first and move to the board later. The other is to bring the board up in parallel. PC first fits our availability better. Starting the board early gives us more time to find hardware problems. A small board test before November would help either way.</w:t>
+        <w:t xml:space="preserve">The MicroBlaze (Stretch Goal)</w:t>
+      </w:r>
+    </w:p>
+    <w:p>
+      <w:pPr>
+        <w:rPr>
+          <w:rFonts w:ascii="Times New Roman" w:hAnsi="Times New Roman" w:cs="Times New Roman"/>
+        </w:rPr>
+      </w:pPr>
+      <w:r>
+        <w:rPr>
+          <w:rFonts w:ascii="Times New Roman" w:hAnsi="Times New Roman" w:cs="Times New Roman"/>
+        </w:rPr>
+        <w:t xml:space="preserve">The approved proposal makes the MicroBlaze a stretch goal. Everything has to work on Windows or Linux first. If we have time, we'd move a small trained model to the board, using its DDR3 memory and audio interface. We'd need to decide which model goes on the board, how data gets there, and what comes back over UART.</w:t>
+      </w:r>
+    </w:p>
+    <w:p>
+      <w:pPr>
+        <w:rPr>
+          <w:rFonts w:ascii="Times New Roman" w:hAnsi="Times New Roman" w:cs="Times New Roman"/>
+        </w:rPr>
+      </w:pPr>
+      <w:r>
+        <w:rPr>
+          <w:rFonts w:ascii="Times New Roman" w:hAnsi="Times New Roman" w:cs="Times New Roman"/>
+        </w:rPr>
+        <w:t xml:space="preserve">We also need to decide whether anyone works on the board before the PC version is done. A small board test before November would tell us early whether the stretch goal is realistic.</w:t>
       </w:r>
     </w:p>
     <w:p>
@@ -547,21 +487,7 @@
         <w:rPr>
           <w:rFonts w:ascii="Times New Roman" w:hAnsi="Times New Roman" w:cs="Times New Roman"/>
         </w:rPr>
-        <w:t xml:space="preserve">What filters are we trying to identify? We need to pick the filter families and the ranges for order and cutoff. We also need to decide whether the filter stays the same over a whole recording. The AI can only learn filters that look like the ones we </w:t>
-      </w:r>
-      <w:proofErr w:type="gramStart"/>
-      <w:r>
-        <w:rPr>
-          <w:rFonts w:ascii="Times New Roman" w:hAnsi="Times New Roman" w:cs="Times New Roman"/>
-        </w:rPr>
-        <w:t>train it</w:t>
-      </w:r>
-      <w:proofErr w:type="gramEnd"/>
-      <w:r>
-        <w:rPr>
-          <w:rFonts w:ascii="Times New Roman" w:hAnsi="Times New Roman" w:cs="Times New Roman"/>
-        </w:rPr>
-        <w:t xml:space="preserve"> on, so this decision sets what we can claim.</w:t>
+        <w:t xml:space="preserve">What filters are we trying to identify? The proposal settles on Butterworth high-pass, low-pass, and band-pass filters, starting at orders 1, 2, and 4. We still need the cutoff ranges, and we need to decide whether the filter stays the same over a whole recording. We also need to agree on how to count band-pass order. If we count total poles, a band-pass can't be first order. If we count each side's slope like a DAW does, a 4th-order band-pass has 8 poles. The AI can only learn filters that look like the ones we train it on, so this decision sets what we can claim.</w:t>
       </w:r>
     </w:p>
     <w:p>
@@ -575,20 +501,20 @@
         <w:rPr>
           <w:rFonts w:ascii="Times New Roman" w:hAnsi="Times New Roman" w:cs="Times New Roman"/>
         </w:rPr>
-        <w:t>Which Filter Settings the AI Estimates</w:t>
-      </w:r>
-    </w:p>
-    <w:p>
-      <w:pPr>
-        <w:rPr>
-          <w:rFonts w:ascii="Times New Roman" w:hAnsi="Times New Roman" w:cs="Times New Roman"/>
-        </w:rPr>
-      </w:pPr>
-      <w:r>
-        <w:rPr>
-          <w:rFonts w:ascii="Times New Roman" w:hAnsi="Times New Roman" w:cs="Times New Roman"/>
-        </w:rPr>
-        <w:t>The proposal's implementation list only mentions the filter type and order. Its example talks about identifying the filter's poles, though, and the inverse filter needs the full response. That means it needs the cutoffs and the family too. We need to decide which settings the AI estimates and which we treat as known. If we give it the cutoffs, we should say the problem is narrower than "unknown filter."</w:t>
+        <w:t>Inverse Filter Method</w:t>
+      </w:r>
+    </w:p>
+    <w:p>
+      <w:pPr>
+        <w:rPr>
+          <w:rFonts w:ascii="Times New Roman" w:hAnsi="Times New Roman" w:cs="Times New Roman"/>
+        </w:rPr>
+      </w:pPr>
+      <w:r>
+        <w:rPr>
+          <w:rFonts w:ascii="Times New Roman" w:hAnsi="Times New Roman" w:cs="Times New Roman"/>
+        </w:rPr>
+        <w:t xml:space="preserve">How do we undo the filter? The proposal calls for a regularized compensation filter, since a straight inverse boosts noise along with the buried sound. We need to pick the method, how much boost to allow, and which frequency range to work on. It runs offline on WAV files, so it doesn't have to be real time.</w:t>
       </w:r>
     </w:p>
     <w:p>
@@ -602,47 +528,6 @@
         <w:rPr>
           <w:rFonts w:ascii="Times New Roman" w:hAnsi="Times New Roman" w:cs="Times New Roman"/>
         </w:rPr>
-        <w:t>Inverse Filter Method</w:t>
-      </w:r>
-    </w:p>
-    <w:p>
-      <w:pPr>
-        <w:rPr>
-          <w:rFonts w:ascii="Times New Roman" w:hAnsi="Times New Roman" w:cs="Times New Roman"/>
-        </w:rPr>
-      </w:pPr>
-      <w:r>
-        <w:rPr>
-          <w:rFonts w:ascii="Times New Roman" w:hAnsi="Times New Roman" w:cs="Times New Roman"/>
-        </w:rPr>
-        <w:t xml:space="preserve">How do we undo the filter? A straight inverse boosts noise along with the buried sound, and some filters can't be inverted cleanly. We need to decide how much boost to allow and which frequency range to work on. We also need to decide whether it </w:t>
-      </w:r>
-      <w:proofErr w:type="gramStart"/>
-      <w:r>
-        <w:rPr>
-          <w:rFonts w:ascii="Times New Roman" w:hAnsi="Times New Roman" w:cs="Times New Roman"/>
-        </w:rPr>
-        <w:t>runs</w:t>
-      </w:r>
-      <w:proofErr w:type="gramEnd"/>
-      <w:r>
-        <w:rPr>
-          <w:rFonts w:ascii="Times New Roman" w:hAnsi="Times New Roman" w:cs="Times New Roman"/>
-        </w:rPr>
-        <w:t xml:space="preserve"> live or after the fact.</w:t>
-      </w:r>
-    </w:p>
-    <w:p>
-      <w:pPr>
-        <w:pStyle w:val="Heading2"/>
-        <w:rPr>
-          <w:rFonts w:ascii="Times New Roman" w:hAnsi="Times New Roman" w:cs="Times New Roman"/>
-        </w:rPr>
-      </w:pPr>
-      <w:r>
-        <w:rPr>
-          <w:rFonts w:ascii="Times New Roman" w:hAnsi="Times New Roman" w:cs="Times New Roman"/>
-        </w:rPr>
         <w:t>Test Data Method</w:t>
       </w:r>
     </w:p>
@@ -656,7 +541,7 @@
         <w:rPr>
           <w:rFonts w:ascii="Times New Roman" w:hAnsi="Times New Roman" w:cs="Times New Roman"/>
         </w:rPr>
-        <w:t>What goes into the test data? The third revision needs this answer. It should cover the sound sources and how speech and events get mixed. It also needs the event levels, the filter ranges, the noise and bit depth, how many examples we make, and how we keep the training and test sounds separate.</w:t>
+        <w:t xml:space="preserve">What goes into the test data? The proposal gives the outline. We use 10-20 independent source recordings at 192 kHz and 24-bit with speech, mechanical tones, broadband sounds, and short transients, and synthetic tones or sweeps can fill gaps. We filter them with known Butterworth settings and add noise at several SNRs, both before and after the filter. We still need to pick the recordings, the event levels, the SNR values, and how many versions we make. We also need to decide whether we make them in a DAW, in Python, or both. If we use a DAW, we have to check that its filters really are Butterworth at the order we label.</w:t>
       </w:r>
     </w:p>
     <w:p>
@@ -684,7 +569,7 @@
         <w:rPr>
           <w:rFonts w:ascii="Times New Roman" w:hAnsi="Times New Roman" w:cs="Times New Roman"/>
         </w:rPr>
-        <w:t>Which events do we detect? The proposal mentions rumble, thumps, and hiss. The list decides which datasets we download and what the second AI model learns. The proposal's example also works out causes, like a bird strike hitting the left engine. That isn't realistic from one microphone. The third revision should say we detect and classify events, but we don't work out causes or locations.</w:t>
+        <w:t xml:space="preserve">Which events do we detect? The proposal names low-frequency rumble, broadband hiss, and short transients. The list decides which recordings we need and what the second AI model learns. The proposal already says this is a proof of concept and not a way to find accident causes, so we only detect and classify events.</w:t>
       </w:r>
     </w:p>
     <w:p>
@@ -711,21 +596,7 @@
         <w:rPr>
           <w:rFonts w:ascii="Times New Roman" w:hAnsi="Times New Roman" w:cs="Times New Roman"/>
         </w:rPr>
-        <w:t xml:space="preserve">How do we identify the filter? Starting with simple models on the average spectrum is a reasonable baseline. Before we try a small neural net, we should agree on what "good enough" means. That could be accuracy, speed, memory, and whether it fits on the </w:t>
-      </w:r>
-      <w:proofErr w:type="spellStart"/>
-      <w:r>
-        <w:rPr>
-          <w:rFonts w:ascii="Times New Roman" w:hAnsi="Times New Roman" w:cs="Times New Roman"/>
-        </w:rPr>
-        <w:t>MicroBlaze</w:t>
-      </w:r>
-      <w:proofErr w:type="spellEnd"/>
-      <w:r>
-        <w:rPr>
-          <w:rFonts w:ascii="Times New Roman" w:hAnsi="Times New Roman" w:cs="Times New Roman"/>
-        </w:rPr>
-        <w:t>. There's also a trap to watch for. A weak low end could mean a high-pass filter, or a source that never had much low end. We'll test on sounds the model has never heard to catch this.</w:t>
+        <w:t xml:space="preserve">How do we identify the filter? Starting with simple models on the average spectrum is a reasonable baseline, and the proposal leaves room for time-domain features too. Before we try a small neural net, we should agree on what "good enough" means. That could be accuracy, cutoff error, speed, and, if we try the board, whether it fits on the MicroBlaze. There's also a trap to watch for. A weak low end could mean a high-pass filter, or a source that never had much low end. We'll test on sounds the model has never heard to catch this.</w:t>
       </w:r>
     </w:p>
     <w:p>
@@ -752,7 +623,7 @@
         <w:rPr>
           <w:rFonts w:ascii="Times New Roman" w:hAnsi="Times New Roman" w:cs="Times New Roman"/>
         </w:rPr>
-        <w:t>How do we prove it works? The main comparison checks event detection on the filtered audio, the recovered audio, and the original audio. We should run recovery twice. One run uses the true filter settings, which shows the best case. The other uses the AI's estimates, which tests the real system. We should also score the filter ID model on its own. Every comparison uses the same held-out examples. We split by source recording before filtering, so the same sound never shows up in both training and testing.</w:t>
+        <w:t xml:space="preserve">How do we prove it works? The main comparison checks event detection on the filtered audio, the recovered audio, and the original audio. We should run recovery twice. One run uses the true filter settings, which shows the best case. The other uses the AI's estimates, which tests the real system. We should also score the filter ID model on its own, with filter type and order accuracy and cutoff error. Event detection gets precision and recall, or accuracy. Every comparison uses the same held-out examples. We split by source recording before filtering, so the same sound never shows up in both training and testing.</w:t>
       </w:r>
     </w:p>
     <w:p>
@@ -779,49 +650,7 @@
         <w:rPr>
           <w:rFonts w:ascii="Times New Roman" w:hAnsi="Times New Roman" w:cs="Times New Roman"/>
         </w:rPr>
-        <w:t xml:space="preserve">Who owns what? The work areas are </w:t>
-      </w:r>
-      <w:proofErr w:type="gramStart"/>
-      <w:r>
-        <w:rPr>
-          <w:rFonts w:ascii="Times New Roman" w:hAnsi="Times New Roman" w:cs="Times New Roman"/>
-        </w:rPr>
-        <w:t>the test</w:t>
-      </w:r>
-      <w:proofErr w:type="gramEnd"/>
-      <w:r>
-        <w:rPr>
-          <w:rFonts w:ascii="Times New Roman" w:hAnsi="Times New Roman" w:cs="Times New Roman"/>
-        </w:rPr>
-        <w:t xml:space="preserve"> data, the filter ID model, the inverse filter, the event model, the C version, the </w:t>
-      </w:r>
-      <w:proofErr w:type="spellStart"/>
-      <w:r>
-        <w:rPr>
-          <w:rFonts w:ascii="Times New Roman" w:hAnsi="Times New Roman" w:cs="Times New Roman"/>
-        </w:rPr>
-        <w:t>MicroBlaze</w:t>
-      </w:r>
-      <w:proofErr w:type="spellEnd"/>
-      <w:r>
-        <w:rPr>
-          <w:rFonts w:ascii="Times New Roman" w:hAnsi="Times New Roman" w:cs="Times New Roman"/>
-        </w:rPr>
-        <w:t xml:space="preserve"> platform, and the report. We'll assign people once the decisions above are made. Everyone will write up their own part </w:t>
-      </w:r>
-      <w:proofErr w:type="gramStart"/>
-      <w:r>
-        <w:rPr>
-          <w:rFonts w:ascii="Times New Roman" w:hAnsi="Times New Roman" w:cs="Times New Roman"/>
-        </w:rPr>
-        <w:t>for</w:t>
-      </w:r>
-      <w:proofErr w:type="gramEnd"/>
-      <w:r>
-        <w:rPr>
-          <w:rFonts w:ascii="Times New Roman" w:hAnsi="Times New Roman" w:cs="Times New Roman"/>
-        </w:rPr>
-        <w:t xml:space="preserve"> the report, since the course wants a section on what each person did.</w:t>
+        <w:t xml:space="preserve">Who owns what? The work areas are the test data, the filter ID model, the inverse filter, the event model, the offline app, and the report. If we get to the stretch goal, the C version and the MicroBlaze platform are areas too. We'll assign people once the decisions above are made. Everyone will write up their own part for the report, since the course wants a section on what each person did.</w:t>
       </w:r>
     </w:p>
     <w:p>
@@ -1194,35 +1023,7 @@
               <w:rPr>
                 <w:rFonts w:ascii="Times New Roman" w:hAnsi="Times New Roman" w:cs="Times New Roman"/>
               </w:rPr>
-              <w:t xml:space="preserve">3. </w:t>
-            </w:r>
-            <w:proofErr w:type="spellStart"/>
-            <w:r>
-              <w:rPr>
-                <w:rFonts w:ascii="Times New Roman" w:hAnsi="Times New Roman" w:cs="Times New Roman"/>
-              </w:rPr>
-              <w:t>MicroBlaze</w:t>
-            </w:r>
-            <w:proofErr w:type="spellEnd"/>
-            <w:r>
-              <w:rPr>
-                <w:rFonts w:ascii="Times New Roman" w:hAnsi="Times New Roman" w:cs="Times New Roman"/>
-              </w:rPr>
-              <w:t xml:space="preserve"> run, </w:t>
-            </w:r>
-            <w:proofErr w:type="gramStart"/>
-            <w:r>
-              <w:rPr>
-                <w:rFonts w:ascii="Times New Roman" w:hAnsi="Times New Roman" w:cs="Times New Roman"/>
-              </w:rPr>
-              <w:t>final results</w:t>
-            </w:r>
-            <w:proofErr w:type="gramEnd"/>
-            <w:r>
-              <w:rPr>
-                <w:rFonts w:ascii="Times New Roman" w:hAnsi="Times New Roman" w:cs="Times New Roman"/>
-              </w:rPr>
-              <w:t>, report</w:t>
+              <w:t xml:space="preserve">3. Offline app, final results, report</w:t>
             </w:r>
           </w:p>
         </w:tc>
@@ -1542,16 +1343,8 @@
               <w:rPr>
                 <w:rFonts w:ascii="Times New Roman" w:hAnsi="Times New Roman" w:cs="Times New Roman"/>
               </w:rPr>
-              <w:t xml:space="preserve">Decisions on scope, the test data method, and what runs on the </w:t>
+              <w:t xml:space="preserve">Decisions on the test data details, band-pass order, and whether we try the MicroBlaze</w:t>
             </w:r>
-            <w:proofErr w:type="spellStart"/>
-            <w:r>
-              <w:rPr>
-                <w:rFonts w:ascii="Times New Roman" w:hAnsi="Times New Roman" w:cs="Times New Roman"/>
-              </w:rPr>
-              <w:t>MicroBlaze</w:t>
-            </w:r>
-            <w:proofErr w:type="spellEnd"/>
           </w:p>
         </w:tc>
       </w:tr>
@@ -1803,19 +1596,11 @@
                 <w:rFonts w:ascii="Times New Roman" w:hAnsi="Times New Roman" w:cs="Times New Roman"/>
               </w:rPr>
             </w:pPr>
-            <w:proofErr w:type="spellStart"/>
             <w:r>
               <w:rPr>
                 <w:rFonts w:ascii="Times New Roman" w:hAnsi="Times New Roman" w:cs="Times New Roman"/>
               </w:rPr>
-              <w:t>MicroBlaze</w:t>
-            </w:r>
-            <w:proofErr w:type="spellEnd"/>
-            <w:r>
-              <w:rPr>
-                <w:rFonts w:ascii="Times New Roman" w:hAnsi="Times New Roman" w:cs="Times New Roman"/>
-              </w:rPr>
-              <w:t xml:space="preserve"> results, the report draft, and code that runs from the README</w:t>
+              <w:t xml:space="preserve">The offline app, the report draft, and code that runs from the README</w:t>
             </w:r>
           </w:p>
         </w:tc>
@@ -2008,21 +1793,7 @@
         <w:rPr>
           <w:rFonts w:ascii="Times New Roman" w:hAnsi="Times New Roman" w:cs="Times New Roman"/>
         </w:rPr>
-        <w:t xml:space="preserve">Stage 3 runs the agreed parts on the </w:t>
-      </w:r>
-      <w:proofErr w:type="spellStart"/>
-      <w:r>
-        <w:rPr>
-          <w:rFonts w:ascii="Times New Roman" w:hAnsi="Times New Roman" w:cs="Times New Roman"/>
-        </w:rPr>
-        <w:t>MicroBlaze</w:t>
-      </w:r>
-      <w:proofErr w:type="spellEnd"/>
-      <w:r>
-        <w:rPr>
-          <w:rFonts w:ascii="Times New Roman" w:hAnsi="Times New Roman" w:cs="Times New Roman"/>
-        </w:rPr>
-        <w:t>, finishes the final runs, and produces the 4-page report draft. The report needs our method, the ideas we tried and dropped, implementation details with figures, the evaluation, and what each person did.</w:t>
+        <w:t xml:space="preserve">Stage 3 wraps the pipeline into the offline app that takes WAV files, finishes the final runs, and produces the 4-page report draft. If there's time, it also tries a small model on the MicroBlaze. The report needs our method, the ideas we tried and dropped, implementation details with figures, the evaluation, and what each person did.</w:t>
       </w:r>
     </w:p>
     <w:p>
@@ -2183,6 +1954,24 @@
           <w:rFonts w:ascii="Times New Roman" w:hAnsi="Times New Roman" w:cs="Times New Roman"/>
         </w:rPr>
         <w:t xml:space="preserve"> applied.</w:t>
+      </w:r>
+    </w:p>
+    <w:p>
+      <w:pPr>
+        <w:pStyle w:val="ListParagraph"/>
+        <w:numPr>
+          <w:ilvl w:val="0"/>
+          <w:numId w:val="2"/>
+        </w:numPr>
+        <w:rPr>
+          <w:rFonts w:ascii="Times New Roman" w:hAnsi="Times New Roman" w:cs="Times New Roman"/>
+        </w:rPr>
+      </w:pPr>
+      <w:r>
+        <w:rPr>
+          <w:rFonts w:ascii="Times New Roman" w:hAnsi="Times New Roman" w:cs="Times New Roman"/>
+        </w:rPr>
+        <w:t xml:space="preserve">If we make the filtered versions in a DAW, its filters might not match the Butterworth settings we label.</w:t>
       </w:r>
     </w:p>
     <w:p>

</xml_diff>

<commit_message>
Add source recordings and the noise comparison to the roadmap
</commit_message>
<xml_diff>
--- a/docs/project-plan.docx
+++ b/docs/project-plan.docx
@@ -1408,7 +1408,7 @@
               <w:rPr>
                 <w:rFonts w:ascii="Times New Roman" w:hAnsi="Times New Roman" w:cs="Times New Roman"/>
               </w:rPr>
-              <w:t>A small dataset, a first filter ID model, and the recovery test with known filters</w:t>
+              <w:t xml:space="preserve">A small dataset from the first recordings, a first filter ID model, and the recovery test with known filters</w:t>
             </w:r>
           </w:p>
         </w:tc>
@@ -1757,7 +1757,7 @@
         <w:rPr>
           <w:rFonts w:ascii="Times New Roman" w:hAnsi="Times New Roman" w:cs="Times New Roman"/>
         </w:rPr>
-        <w:t>Stage 1 finishes the test data generator and trains the first filter ID model. It also runs the recovery test with the true filter settings. That test shows how deep a cut can be before a sound can't be reliably brought back.</w:t>
+        <w:t xml:space="preserve">Stage 1 picks or records the first source recordings and labels the events in them. It also finishes the test data generator and trains the first filter ID model, which predicts the filter type, order, and cutoffs. Then it runs the recovery test with the true filter settings. That test shows how deep a cut can be before a sound can't be reliably brought back.</w:t>
       </w:r>
     </w:p>
     <w:p>
@@ -1775,7 +1775,7 @@
         <w:rPr>
           <w:rFonts w:ascii="Times New Roman" w:hAnsi="Times New Roman" w:cs="Times New Roman"/>
         </w:rPr>
-        <w:t>Stage 2 builds the inverse filter around the AI's estimates and builds the event model. It also runs the main comparison.</w:t>
+        <w:t xml:space="preserve">Stage 2 builds the inverse filter around the AI's estimates and builds the event model. It also runs the main comparison, including noise added before versus after the filter.</w:t>
       </w:r>
     </w:p>
     <w:p>

</xml_diff>